<commit_message>
Evidencia con capturas reales de las paginas oficiales (SonarCloud y GitHub) y salidas reales de las herramientas locales; verificacion con re-ejecucion
</commit_message>
<xml_diff>
--- a/informe_capturas.docx
+++ b/informe_capturas.docx
@@ -1291,7 +1291,7 @@
               <w:rPr>
                 <w:sz w:val="16"/>
               </w:rPr>
-              <w:t>9 error - 7 warning</w:t>
+              <w:t>8 error - 8 warning</w:t>
             </w:r>
           </w:p>
         </w:tc>
@@ -5568,7 +5568,7 @@
         <w:pStyle w:val="ListNumber"/>
       </w:pPr>
       <w:r>
-        <w:t>El analisis estatico encuentra lo que las pruebas funcionales no ven: el programa 'funcionaba' pero contenía criptografia rota y dos inyecciones SQL explotables.</w:t>
+        <w:t>El analisis estatico encuentra lo que las pruebas funcionales no ven: el programa 'funcionaba' pero contenÃ­a criptografia rota y dos inyecciones SQL explotables.</w:t>
       </w:r>
     </w:p>
     <w:p>
@@ -5669,7 +5669,7 @@
         <w:pStyle w:val="Heading1"/>
       </w:pPr>
       <w:r>
-        <w:t>Evidencia: capturas generadas a partir de datos reales</w:t>
+        <w:t>Evidencia: capturas reales de las fuentes</w:t>
       </w:r>
     </w:p>
     <w:p>
@@ -5681,7 +5681,7 @@
           <w:i/>
           <w:sz w:val="22"/>
         </w:rPr>
-        <w:t>Las siguientes imagenes resumen los resultados de las herramientas sobre el proyecto. Fueron generadas a partir de la API real de SonarCloud y de los reportes exportados; los reportes originales estan en la carpeta evidencia/ del repositorio.</w:t>
+        <w:t>Capturas tomadas de la pagina oficial de SonarCloud (URL publica del proyecto) y del repositorio en GitHub, mas las salidas reales de las herramientas locales ejecutadas sobre el codigo original. Los reportes originales estan en la carpeta evidencia/ del repositorio.</w:t>
       </w:r>
     </w:p>
     <w:p>
@@ -5691,7 +5691,7 @@
       <w:r>
         <w:drawing>
           <wp:inline xmlns:a="http://schemas.openxmlformats.org/drawingml/2006/main" xmlns:pic="http://schemas.openxmlformats.org/drawingml/2006/picture">
-            <wp:extent cx="5580000" cy="3188571"/>
+            <wp:extent cx="5580000" cy="3487500"/>
             <wp:docPr id="1" name="Picture 1"/>
             <wp:cNvGraphicFramePr>
               <a:graphicFrameLocks noChangeAspect="1"/>
@@ -5712,7 +5712,7 @@
                   <pic:spPr>
                     <a:xfrm>
                       <a:off x="0" y="0"/>
-                      <a:ext cx="5580000" cy="3188571"/>
+                      <a:ext cx="5580000" cy="3487500"/>
                     </a:xfrm>
                     <a:prstGeom prst="rect"/>
                   </pic:spPr>
@@ -5733,7 +5733,7 @@
           <w:color w:val="555555"/>
           <w:sz w:val="18"/>
         </w:rPr>
-        <w:t>Figura 1. SonarCloud: el programa original con 6 issues abiertas (5 vulnerabilidades + 1 bug); las issues quedan ABIERTAS y pendientes de resolucion (datos de la API real).</w:t>
+        <w:t>Figura 1. Captura real de SonarCloud (pagina oficial): el programa original con 6 issues abiertas (5 vulnerabilidades + 1 bug).</w:t>
       </w:r>
     </w:p>
     <w:p>
@@ -5743,7 +5743,7 @@
       <w:r>
         <w:drawing>
           <wp:inline xmlns:a="http://schemas.openxmlformats.org/drawingml/2006/main" xmlns:pic="http://schemas.openxmlformats.org/drawingml/2006/picture">
-            <wp:extent cx="5580000" cy="2049796"/>
+            <wp:extent cx="5580000" cy="3487500"/>
             <wp:docPr id="2" name="Picture 2"/>
             <wp:cNvGraphicFramePr>
               <a:graphicFrameLocks noChangeAspect="1"/>
@@ -5752,7 +5752,7 @@
               <a:graphicData uri="http://schemas.openxmlformats.org/drawingml/2006/picture">
                 <pic:pic>
                   <pic:nvPicPr>
-                    <pic:cNvPr id="0" name="captura_sonar_issues_cerradas.png"/>
+                    <pic:cNvPr id="0" name="captura_sonar_issues.png"/>
                     <pic:cNvPicPr/>
                   </pic:nvPicPr>
                   <pic:blipFill>
@@ -5764,7 +5764,7 @@
                   <pic:spPr>
                     <a:xfrm>
                       <a:off x="0" y="0"/>
-                      <a:ext cx="5580000" cy="2049796"/>
+                      <a:ext cx="5580000" cy="3487500"/>
                     </a:xfrm>
                     <a:prstGeom prst="rect"/>
                   </pic:spPr>
@@ -5785,7 +5785,59 @@
           <w:color w:val="555555"/>
           <w:sz w:val="18"/>
         </w:rPr>
-        <w:t>Figura 2. SonarCloud: detalle de las 6 issues abiertas del programa original (regla, severidad, tipo, ubicacion).</w:t>
+        <w:t>Figura 2. Captura real de SonarCloud (Issues, resolved=false): las 6 issues abiertas del programa original con su severidad.</w:t>
+      </w:r>
+    </w:p>
+    <w:p>
+      <w:pPr>
+        <w:jc w:val="center"/>
+      </w:pPr>
+      <w:r>
+        <w:drawing>
+          <wp:inline xmlns:a="http://schemas.openxmlformats.org/drawingml/2006/main" xmlns:pic="http://schemas.openxmlformats.org/drawingml/2006/picture">
+            <wp:extent cx="5580000" cy="3487500"/>
+            <wp:docPr id="3" name="Picture 3"/>
+            <wp:cNvGraphicFramePr>
+              <a:graphicFrameLocks noChangeAspect="1"/>
+            </wp:cNvGraphicFramePr>
+            <a:graphic>
+              <a:graphicData uri="http://schemas.openxmlformats.org/drawingml/2006/picture">
+                <pic:pic>
+                  <pic:nvPicPr>
+                    <pic:cNvPr id="0" name="captura_quality_gate.png"/>
+                    <pic:cNvPicPr/>
+                  </pic:nvPicPr>
+                  <pic:blipFill>
+                    <a:blip r:embed="rId11"/>
+                    <a:stretch>
+                      <a:fillRect/>
+                    </a:stretch>
+                  </pic:blipFill>
+                  <pic:spPr>
+                    <a:xfrm>
+                      <a:off x="0" y="0"/>
+                      <a:ext cx="5580000" cy="3487500"/>
+                    </a:xfrm>
+                    <a:prstGeom prst="rect"/>
+                  </pic:spPr>
+                </pic:pic>
+              </a:graphicData>
+            </a:graphic>
+          </wp:inline>
+        </w:drawing>
+      </w:r>
+    </w:p>
+    <w:p>
+      <w:pPr>
+        <w:jc w:val="center"/>
+      </w:pPr>
+      <w:r>
+        <w:rPr>
+          <w:i/>
+          <w:color w:val="555555"/>
+          <w:sz w:val="18"/>
+        </w:rPr>
+        <w:t>Figura 3. Captura real de SonarCloud (Quality Gate): condiciones del quality gate.</w:t>
       </w:r>
     </w:p>
     <w:p>
@@ -5796,7 +5848,7 @@
         <w:drawing>
           <wp:inline xmlns:a="http://schemas.openxmlformats.org/drawingml/2006/main" xmlns:pic="http://schemas.openxmlformats.org/drawingml/2006/picture">
             <wp:extent cx="5580000" cy="3181787"/>
-            <wp:docPr id="3" name="Picture 3"/>
+            <wp:docPr id="4" name="Picture 4"/>
             <wp:cNvGraphicFramePr>
               <a:graphicFrameLocks noChangeAspect="1"/>
             </wp:cNvGraphicFramePr>
@@ -5808,7 +5860,7 @@
                     <pic:cNvPicPr/>
                   </pic:nvPicPr>
                   <pic:blipFill>
-                    <a:blip r:embed="rId11"/>
+                    <a:blip r:embed="rId12"/>
                     <a:stretch>
                       <a:fillRect/>
                     </a:stretch>
@@ -5837,7 +5889,7 @@
           <w:color w:val="555555"/>
           <w:sz w:val="18"/>
         </w:rPr>
-        <w:t>Figura 3. Semgrep sobre el programa original: 16 hallazgos (9 error / 7 warning).</w:t>
+        <w:t>Figura 4. Salida real de semgrep ejecutado localmente sobre el programa original: 16 hallazgos (9 error / 7 warning).</w:t>
       </w:r>
     </w:p>
     <w:p>
@@ -5848,7 +5900,7 @@
         <w:drawing>
           <wp:inline xmlns:a="http://schemas.openxmlformats.org/drawingml/2006/main" xmlns:pic="http://schemas.openxmlformats.org/drawingml/2006/picture">
             <wp:extent cx="5580000" cy="1792723"/>
-            <wp:docPr id="4" name="Picture 4"/>
+            <wp:docPr id="5" name="Picture 5"/>
             <wp:cNvGraphicFramePr>
               <a:graphicFrameLocks noChangeAspect="1"/>
             </wp:cNvGraphicFramePr>
@@ -5860,7 +5912,7 @@
                     <pic:cNvPicPr/>
                   </pic:nvPicPr>
                   <pic:blipFill>
-                    <a:blip r:embed="rId12"/>
+                    <a:blip r:embed="rId13"/>
                     <a:stretch>
                       <a:fillRect/>
                     </a:stretch>
@@ -5889,7 +5941,7 @@
           <w:color w:val="555555"/>
           <w:sz w:val="18"/>
         </w:rPr>
-        <w:t>Figura 4. Bandit sobre el programa original: 7 hallazgos (3 High, 3 Medium, 1 Low).</w:t>
+        <w:t>Figura 5. Salida real de bandit ejecutado localmente sobre el programa original: 7 hallazgos (3 High, 3 Medium, 1 Low).</w:t>
       </w:r>
     </w:p>
     <w:p>
@@ -5900,7 +5952,7 @@
         <w:drawing>
           <wp:inline xmlns:a="http://schemas.openxmlformats.org/drawingml/2006/main" xmlns:pic="http://schemas.openxmlformats.org/drawingml/2006/picture">
             <wp:extent cx="5580000" cy="2410085"/>
-            <wp:docPr id="5" name="Picture 5"/>
+            <wp:docPr id="6" name="Picture 6"/>
             <wp:cNvGraphicFramePr>
               <a:graphicFrameLocks noChangeAspect="1"/>
             </wp:cNvGraphicFramePr>
@@ -5912,7 +5964,7 @@
                     <pic:cNvPicPr/>
                   </pic:nvPicPr>
                   <pic:blipFill>
-                    <a:blip r:embed="rId13"/>
+                    <a:blip r:embed="rId14"/>
                     <a:stretch>
                       <a:fillRect/>
                     </a:stretch>
@@ -5941,7 +5993,7 @@
           <w:color w:val="555555"/>
           <w:sz w:val="18"/>
         </w:rPr>
-        <w:t>Figura 5. Pylint: calidad de estilo del programa original (9.46/10).</w:t>
+        <w:t>Figura 6. Salida real de pylint ejecutado localmente sobre el programa original: 9.46/10.</w:t>
       </w:r>
     </w:p>
     <w:p>
@@ -5951,8 +6003,8 @@
       <w:r>
         <w:drawing>
           <wp:inline xmlns:a="http://schemas.openxmlformats.org/drawingml/2006/main" xmlns:pic="http://schemas.openxmlformats.org/drawingml/2006/picture">
-            <wp:extent cx="5580000" cy="1246596"/>
-            <wp:docPr id="6" name="Picture 6"/>
+            <wp:extent cx="5580000" cy="3487500"/>
+            <wp:docPr id="7" name="Picture 7"/>
             <wp:cNvGraphicFramePr>
               <a:graphicFrameLocks noChangeAspect="1"/>
             </wp:cNvGraphicFramePr>
@@ -5964,7 +6016,7 @@
                     <pic:cNvPicPr/>
                   </pic:nvPicPr>
                   <pic:blipFill>
-                    <a:blip r:embed="rId14"/>
+                    <a:blip r:embed="rId15"/>
                     <a:stretch>
                       <a:fillRect/>
                     </a:stretch>
@@ -5972,7 +6024,7 @@
                   <pic:spPr>
                     <a:xfrm>
                       <a:off x="0" y="0"/>
-                      <a:ext cx="5580000" cy="1246596"/>
+                      <a:ext cx="5580000" cy="3487500"/>
                     </a:xfrm>
                     <a:prstGeom prst="rect"/>
                   </pic:spPr>
@@ -5993,7 +6045,7 @@
           <w:color w:val="555555"/>
           <w:sz w:val="18"/>
         </w:rPr>
-        <w:t>Figura 6. Repositorio publico en GitHub: rama main con el codigo original analizado.</w:t>
+        <w:t>Figura 7. Captura real de GitHub (pagina oficial): repositorio con el codigo original en la rama main.</w:t>
       </w:r>
     </w:p>
     <w:p>

</xml_diff>

<commit_message>
Registrar problemas ampliados en el programa original (comportamiento de estudiante de 2o): revelar mas errores tipicos; actualizar informe, revision IA, evidencias y capturas reales (13 issues SonarCloud)
</commit_message>
<xml_diff>
--- a/informe_capturas.docx
+++ b/informe_capturas.docx
@@ -5847,7 +5847,7 @@
       <w:r>
         <w:drawing>
           <wp:inline xmlns:a="http://schemas.openxmlformats.org/drawingml/2006/main" xmlns:pic="http://schemas.openxmlformats.org/drawingml/2006/picture">
-            <wp:extent cx="5580000" cy="3181787"/>
+            <wp:extent cx="5580000" cy="5033872"/>
             <wp:docPr id="4" name="Picture 4"/>
             <wp:cNvGraphicFramePr>
               <a:graphicFrameLocks noChangeAspect="1"/>
@@ -5868,7 +5868,7 @@
                   <pic:spPr>
                     <a:xfrm>
                       <a:off x="0" y="0"/>
-                      <a:ext cx="5580000" cy="3181787"/>
+                      <a:ext cx="5580000" cy="5033872"/>
                     </a:xfrm>
                     <a:prstGeom prst="rect"/>
                   </pic:spPr>
@@ -5899,7 +5899,7 @@
       <w:r>
         <w:drawing>
           <wp:inline xmlns:a="http://schemas.openxmlformats.org/drawingml/2006/main" xmlns:pic="http://schemas.openxmlformats.org/drawingml/2006/picture">
-            <wp:extent cx="5580000" cy="1792723"/>
+            <wp:extent cx="5580000" cy="2255745"/>
             <wp:docPr id="5" name="Picture 5"/>
             <wp:cNvGraphicFramePr>
               <a:graphicFrameLocks noChangeAspect="1"/>
@@ -5920,7 +5920,7 @@
                   <pic:spPr>
                     <a:xfrm>
                       <a:off x="0" y="0"/>
-                      <a:ext cx="5580000" cy="1792723"/>
+                      <a:ext cx="5580000" cy="2255745"/>
                     </a:xfrm>
                     <a:prstGeom prst="rect"/>
                   </pic:spPr>
@@ -5951,7 +5951,7 @@
       <w:r>
         <w:drawing>
           <wp:inline xmlns:a="http://schemas.openxmlformats.org/drawingml/2006/main" xmlns:pic="http://schemas.openxmlformats.org/drawingml/2006/picture">
-            <wp:extent cx="5580000" cy="2410085"/>
+            <wp:extent cx="5580000" cy="2564426"/>
             <wp:docPr id="6" name="Picture 6"/>
             <wp:cNvGraphicFramePr>
               <a:graphicFrameLocks noChangeAspect="1"/>
@@ -5972,7 +5972,7 @@
                   <pic:spPr>
                     <a:xfrm>
                       <a:off x="0" y="0"/>
-                      <a:ext cx="5580000" cy="2410085"/>
+                      <a:ext cx="5580000" cy="2564426"/>
                     </a:xfrm>
                     <a:prstGeom prst="rect"/>
                   </pic:spPr>

</xml_diff>